<commit_message>
fix: permitir varias afiliaciones por contratista + acta 1 hoja + correo rediseñado
- Afiliaciones: se quita la restricción UNIQUE del número de documento (form y BD).
  Un mismo contratista puede tener varias afiliaciones (nuevos contratos); ya no
  bloquea con "el número de documento ya ha sido registrado".
- Acta de Necesidad: la plantilla elimina la firma anclada duplicada/mal ubicada
  (causaba doble firma y hoja extra), márgenes ajustados y export con PageRange=1.
- Correo de acta aprobada rediseñado: institucional, consistente, con logo y sin emojis.

Co-Authored-By: Claude Sonnet 4.6 <noreply@anthropic.com>
</commit_message>
<xml_diff>
--- a/resources/document-templates/acta_necesidad.docx
+++ b/resources/document-templates/acta_necesidad.docx
@@ -960,7 +960,7 @@
       <w:tr>
         <w:trPr>
           <w:cantSplit w:val="0"/>
-          <w:trHeight w:val="1500" w:hRule="atLeast"/>
+          <w:trHeight w:val="1150" w:hRule="atLeast"/>
           <w:tblHeader w:val="0"/>
         </w:trPr>
         <w:tc>
@@ -1235,91 +1235,13 @@
         </w:tc>
       </w:tr>
     </w:tbl>
-    <w:p>
-      <w:pPr>
-        <w:widowControl w:val="0"/>
-        <w:spacing w:after="0" w:line="276" w:lineRule="auto"/>
-        <w:rPr>
-          <w:rFonts w:ascii="Arial" w:cs="Arial" w:eastAsia="Arial" w:hAnsi="Arial"/>
-        </w:rPr>
-      </w:pPr>
-      <w:r>
-        <w:rPr>
-          <w:rFonts w:ascii="Arial" w:cs="Arial" w:eastAsia="Arial" w:hAnsi="Arial"/>
-          <w:rtl w:val="0"/>
-        </w:rPr>
-        <w:tab/>
-        <w:tab/>
-        <w:tab/>
-        <w:tab/>
-        <w:tab/>
-        <w:tab/>
-        <w:tab/>
-        <w:tab/>
-        <w:tab/>
-        <w:tab/>
-        <w:tab/>
-        <w:tab/>
-        <w:tab/>
-        <w:tab/>
-        <w:tab/>
-        <w:tab/>
-      </w:r>
-      <w:r>
-        <w:rPr>
-          <w:rtl w:val="0"/>
-        </w:rPr>
-      </w:r>
-      <w:r>
-        <w:drawing>
-          <wp:anchor allowOverlap="1" behindDoc="0" distB="114300" distT="114300" distL="114300" distR="114300" hidden="0" layoutInCell="1" locked="0" relativeHeight="0" simplePos="0">
-            <wp:simplePos x="0" y="0"/>
-            <wp:positionH relativeFrom="column">
-              <wp:posOffset>2181225</wp:posOffset>
-            </wp:positionH>
-            <wp:positionV relativeFrom="paragraph">
-              <wp:posOffset>3228975</wp:posOffset>
-            </wp:positionV>
-            <wp:extent cx="1738313" cy="1410672"/>
-            <wp:effectExtent b="0" l="0" r="0" t="0"/>
-            <wp:wrapNone/>
-            <wp:docPr id="4" name="image2.png"/>
-            <a:graphic>
-              <a:graphicData uri="http://schemas.openxmlformats.org/drawingml/2006/picture">
-                <pic:pic>
-                  <pic:nvPicPr>
-                    <pic:cNvPr id="0" name="image2.png"/>
-                    <pic:cNvPicPr preferRelativeResize="0"/>
-                  </pic:nvPicPr>
-                  <pic:blipFill>
-                    <a:blip r:embed="rId6"/>
-                    <a:srcRect b="0" l="0" r="0" t="0"/>
-                    <a:stretch>
-                      <a:fillRect/>
-                    </a:stretch>
-                  </pic:blipFill>
-                  <pic:spPr>
-                    <a:xfrm>
-                      <a:off x="0" y="0"/>
-                      <a:ext cx="1738313" cy="1410672"/>
-                    </a:xfrm>
-                    <a:prstGeom prst="rect"/>
-                    <a:ln/>
-                  </pic:spPr>
-                </pic:pic>
-              </a:graphicData>
-            </a:graphic>
-          </wp:anchor>
-        </w:drawing>
-      </w:r>
-    </w:p>
     <w:sectPr>
       <w:headerReference r:id="rId7" w:type="default"/>
       <w:headerReference r:id="rId8" w:type="first"/>
       <w:footerReference r:id="rId9" w:type="default"/>
       <w:footerReference r:id="rId10" w:type="first"/>
       <w:pgSz w:h="12240" w:w="15840" w:orient="landscape"/>
-      <w:pgMar w:bottom="1417.3228346456694" w:top="1417.3228346456694" w:left="1417.3228346456694" w:right="1417.3228346456694" w:header="284" w:footer="1304"/>
+      <w:pgMar w:bottom="150" w:top="360" w:left="850" w:right="850" w:header="180" w:footer="120"/>
       <w:pgNumType w:start="1"/>
       <w:titlePg w:val="1"/>
     </w:sectPr>

</xml_diff>

<commit_message>
fix(actas): usar la plantilla oficial corregida (1 sola hoja, sin recuadro)
- Se reemplaza la plantilla por la versión corregida provista (sin el recuadro
  vacío que empujaba el contenido a una segunda hoja).
- Se conserva la firma del alcalde que ya trae la plantilla.
- Se retira el QR embebido en el documento: crecía la tabla y rompía el ajuste a
  una sola página. La verificación de autenticidad sigue disponible por la página
  pública y el botón del correo (código de verificación).

Co-Authored-By: Claude Sonnet 4.6 <noreply@anthropic.com>
</commit_message>
<xml_diff>
--- a/resources/document-templates/acta_necesidad.docx
+++ b/resources/document-templates/acta_necesidad.docx
@@ -358,12 +358,6 @@
                 <w:rtl w:val="0"/>
               </w:rPr>
             </w:r>
-            <w:r>
-              <w:rPr>
-                <w:rFonts w:ascii="Arial Narrow" w:cs="Arial Narrow" w:eastAsia="Arial Narrow" w:hAnsi="Arial Narrow"/>
-              </w:rPr>
-              <w:t xml:space="preserve">${qr_verificacion}</w:t>
-            </w:r>
           </w:p>
         </w:tc>
       </w:tr>
@@ -960,7 +954,7 @@
       <w:tr>
         <w:trPr>
           <w:cantSplit w:val="0"/>
-          <w:trHeight w:val="1150" w:hRule="atLeast"/>
+          <w:trHeight w:val="1500" w:hRule="atLeast"/>
           <w:tblHeader w:val="0"/>
         </w:trPr>
         <w:tc>
@@ -1091,9 +1085,7 @@
                 <w:szCs w:val="16"/>
                 <w:rtl w:val="0"/>
               </w:rPr>
-              <w:t xml:space="preserve">${firma_alcalde}</w:t>
-              <w:br/>
-              <w:t xml:space="preserve">${label_alcalde}</w:t>
+              <w:t xml:space="preserve">Vo Bo. Alcalde Municipal</w:t>
             </w:r>
           </w:p>
         </w:tc>
@@ -1235,13 +1227,91 @@
         </w:tc>
       </w:tr>
     </w:tbl>
+    <w:p>
+      <w:pPr>
+        <w:widowControl w:val="0"/>
+        <w:spacing w:after="0" w:line="276" w:lineRule="auto"/>
+        <w:rPr>
+          <w:rFonts w:ascii="Arial" w:cs="Arial" w:eastAsia="Arial" w:hAnsi="Arial"/>
+        </w:rPr>
+      </w:pPr>
+      <w:r>
+        <w:rPr>
+          <w:rFonts w:ascii="Arial" w:cs="Arial" w:eastAsia="Arial" w:hAnsi="Arial"/>
+          <w:rtl w:val="0"/>
+        </w:rPr>
+        <w:tab/>
+        <w:tab/>
+        <w:tab/>
+        <w:tab/>
+        <w:tab/>
+        <w:tab/>
+        <w:tab/>
+        <w:tab/>
+        <w:tab/>
+        <w:tab/>
+        <w:tab/>
+        <w:tab/>
+        <w:tab/>
+        <w:tab/>
+        <w:tab/>
+        <w:tab/>
+      </w:r>
+      <w:r>
+        <w:rPr>
+          <w:rtl w:val="0"/>
+        </w:rPr>
+      </w:r>
+      <w:r>
+        <w:drawing>
+          <wp:anchor allowOverlap="1" behindDoc="0" distB="114300" distT="114300" distL="114300" distR="114300" hidden="0" layoutInCell="1" locked="0" relativeHeight="0" simplePos="0">
+            <wp:simplePos x="0" y="0"/>
+            <wp:positionH relativeFrom="column">
+              <wp:posOffset>2181225</wp:posOffset>
+            </wp:positionH>
+            <wp:positionV relativeFrom="paragraph">
+              <wp:posOffset>3228975</wp:posOffset>
+            </wp:positionV>
+            <wp:extent cx="1738313" cy="1410672"/>
+            <wp:effectExtent b="0" l="0" r="0" t="0"/>
+            <wp:wrapNone/>
+            <wp:docPr id="4" name="image2.png"/>
+            <a:graphic>
+              <a:graphicData uri="http://schemas.openxmlformats.org/drawingml/2006/picture">
+                <pic:pic>
+                  <pic:nvPicPr>
+                    <pic:cNvPr id="0" name="image2.png"/>
+                    <pic:cNvPicPr preferRelativeResize="0"/>
+                  </pic:nvPicPr>
+                  <pic:blipFill>
+                    <a:blip r:embed="rId6"/>
+                    <a:srcRect b="0" l="0" r="0" t="0"/>
+                    <a:stretch>
+                      <a:fillRect/>
+                    </a:stretch>
+                  </pic:blipFill>
+                  <pic:spPr>
+                    <a:xfrm>
+                      <a:off x="0" y="0"/>
+                      <a:ext cx="1738313" cy="1410672"/>
+                    </a:xfrm>
+                    <a:prstGeom prst="rect"/>
+                    <a:ln/>
+                  </pic:spPr>
+                </pic:pic>
+              </a:graphicData>
+            </a:graphic>
+          </wp:anchor>
+        </w:drawing>
+      </w:r>
+    </w:p>
     <w:sectPr>
       <w:headerReference r:id="rId7" w:type="default"/>
       <w:headerReference r:id="rId8" w:type="first"/>
       <w:footerReference r:id="rId9" w:type="default"/>
       <w:footerReference r:id="rId10" w:type="first"/>
       <w:pgSz w:h="12240" w:w="15840" w:orient="landscape"/>
-      <w:pgMar w:bottom="150" w:top="360" w:left="850" w:right="850" w:header="180" w:footer="120"/>
+      <w:pgMar w:bottom="1417.3228346456694" w:top="1417.3228346456694" w:left="1417.3228346456694" w:right="1417.3228346456694" w:header="284" w:footer="1304"/>
       <w:pgNumType w:start="1"/>
       <w:titlePg w:val="1"/>
     </w:sectPr>
@@ -1660,12 +1730,12 @@
         <wp:inline distB="0" distT="0" distL="0" distR="0">
           <wp:extent cx="1169803" cy="976110"/>
           <wp:effectExtent b="0" l="0" r="0" t="0"/>
-          <wp:docPr id="3" name="image1.jpg"/>
+          <wp:docPr id="3" name="image3.jpg"/>
           <a:graphic>
             <a:graphicData uri="http://schemas.openxmlformats.org/drawingml/2006/picture">
               <pic:pic>
                 <pic:nvPicPr>
-                  <pic:cNvPr id="0" name="image1.jpg"/>
+                  <pic:cNvPr id="0" name="image3.jpg"/>
                   <pic:cNvPicPr preferRelativeResize="0"/>
                 </pic:nvPicPr>
                 <pic:blipFill>
@@ -1782,12 +1852,12 @@
         <wp:inline distB="0" distT="0" distL="0" distR="0">
           <wp:extent cx="1169803" cy="976110"/>
           <wp:effectExtent b="0" l="0" r="0" t="0"/>
-          <wp:docPr id="5" name="image3.png"/>
+          <wp:docPr id="5" name="image1.png"/>
           <a:graphic>
             <a:graphicData uri="http://schemas.openxmlformats.org/drawingml/2006/picture">
               <pic:pic>
                 <pic:nvPicPr>
-                  <pic:cNvPr id="0" name="image3.png"/>
+                  <pic:cNvPr id="0" name="image1.png"/>
                   <pic:cNvPicPr preferRelativeResize="0"/>
                 </pic:nvPicPr>
                 <pic:blipFill>

</xml_diff>

<commit_message>
fix(actas): quitar el borde de la marca de agua (era el recuadro visible)
VML dibuja borde por defecto en la imagen de marca de agua del encabezado; se
fuerza stroked="f". El acta queda limpia en una sola hoja.

Co-Authored-By: Claude Sonnet 4.6 <noreply@anthropic.com>
</commit_message>
<xml_diff>
--- a/resources/document-templates/acta_necesidad.docx
+++ b/resources/document-templates/acta_necesidad.docx
@@ -1425,7 +1425,7 @@
     <w:r>
       <w:rPr/>
       <w:pict>
-        <v:shape id="WordPictureWatermark1" style="position:absolute;width:498.59999999999997pt;height:498.59999999999997pt;rotation:0;z-index:-503316481;mso-position-horizontal-relative:margin;mso-position-horizontal:center;mso-position-vertical-relative:margin;mso-position-vertical:center;" alt="" type="#_x0000_t75">
+        <v:shape stroked="f" id="WordPictureWatermark1" style="position:absolute;width:498.59999999999997pt;height:498.59999999999997pt;rotation:0;z-index:-503316481;mso-position-horizontal-relative:margin;mso-position-horizontal:center;mso-position-vertical-relative:margin;mso-position-vertical:center;" alt="" type="#_x0000_t75">
           <v:imagedata blacklevel="22938f" cropbottom="0f" cropleft="0f" cropright="0f" croptop="0f" gain="19661f" r:id="rId1" o:title="image6.png"/>
         </v:shape>
       </w:pict>
@@ -1435,198 +1435,7 @@
         <w:rtl w:val="0"/>
       </w:rPr>
     </w:r>
-    <w:r>
-      <mc:AlternateContent>
-        <mc:Choice Requires="wpg">
-          <w:drawing>
-            <wp:anchor allowOverlap="1" behindDoc="0" distB="0" distT="0" distL="114300" distR="114300" hidden="0" layoutInCell="1" locked="0" relativeHeight="0" simplePos="0">
-              <wp:simplePos x="0" y="0"/>
-              <wp:positionH relativeFrom="column">
-                <wp:posOffset>2654300</wp:posOffset>
-              </wp:positionH>
-              <wp:positionV relativeFrom="paragraph">
-                <wp:posOffset>165100</wp:posOffset>
-              </wp:positionV>
-              <wp:extent cx="5443537" cy="1204913"/>
-              <wp:effectExtent b="0" l="0" r="0" t="0"/>
-              <wp:wrapNone/>
-              <wp:docPr id="1" name=""/>
-              <a:graphic>
-                <a:graphicData uri="http://schemas.microsoft.com/office/word/2010/wordprocessingShape">
-                  <wps:wsp>
-                    <wps:cNvSpPr/>
-                    <wps:cNvPr id="2" name="Shape 2"/>
-                    <wps:spPr>
-                      <a:xfrm>
-                        <a:off x="2628994" y="3182306"/>
-                        <a:ext cx="5434012" cy="1195388"/>
-                      </a:xfrm>
-                      <a:prstGeom prst="rect">
-                        <a:avLst/>
-                      </a:prstGeom>
-                      <a:noFill/>
-                      <a:ln>
-                        <a:noFill/>
-                      </a:ln>
-                    </wps:spPr>
-                    <wps:txbx>
-                      <w:txbxContent>
-                        <w:p>
-                          <w:pPr>
-                            <w:spacing w:after="0" w:before="0" w:line="240"/>
-                            <w:ind w:left="0" w:right="0" w:firstLine="0"/>
-                            <w:jc w:val="center"/>
-                            <w:textDirection w:val="btLr"/>
-                          </w:pPr>
-                        </w:p>
-                        <w:p>
-                          <w:pPr>
-                            <w:spacing w:after="0" w:before="0" w:line="240"/>
-                            <w:ind w:left="0" w:right="0" w:firstLine="0"/>
-                            <w:jc w:val="center"/>
-                            <w:textDirection w:val="btLr"/>
-                          </w:pPr>
-                          <w:r>
-                            <w:rPr>
-                              <w:rFonts w:ascii="Arial" w:cs="Arial" w:eastAsia="Arial" w:hAnsi="Arial"/>
-                              <w:b w:val="1"/>
-                              <w:i w:val="0"/>
-                              <w:smallCaps w:val="0"/>
-                              <w:strike w:val="0"/>
-                              <w:color w:val="000000"/>
-                              <w:sz w:val="44"/>
-                              <w:vertAlign w:val="baseline"/>
-                            </w:rPr>
-                          </w:r>
-                        </w:p>
-                        <w:p>
-                          <w:pPr>
-                            <w:spacing w:after="0" w:before="0" w:line="240"/>
-                            <w:ind w:left="0" w:right="0" w:firstLine="0"/>
-                            <w:jc w:val="center"/>
-                            <w:textDirection w:val="btLr"/>
-                          </w:pPr>
-                          <w:r>
-                            <w:rPr>
-                              <w:rFonts w:ascii="Arial" w:cs="Arial" w:eastAsia="Arial" w:hAnsi="Arial"/>
-                              <w:b w:val="1"/>
-                              <w:i w:val="0"/>
-                              <w:smallCaps w:val="0"/>
-                              <w:strike w:val="0"/>
-                              <w:color w:val="000000"/>
-                              <w:sz w:val="32"/>
-                              <w:vertAlign w:val="baseline"/>
-                            </w:rPr>
-                          </w:r>
-                          <w:r>
-                            <w:rPr>
-                              <w:rFonts w:ascii="Arial" w:cs="Arial" w:eastAsia="Arial" w:hAnsi="Arial"/>
-                              <w:b w:val="1"/>
-                              <w:i w:val="0"/>
-                              <w:smallCaps w:val="0"/>
-                              <w:strike w:val="0"/>
-                              <w:color w:val="000000"/>
-                              <w:sz w:val="28"/>
-                              <w:vertAlign w:val="baseline"/>
-                            </w:rPr>
-                            <w:t xml:space="preserve">ALCALDÍA MUNICIPAL DE PUERTO BOYACÁ - BOYACA</w:t>
-                          </w:r>
-                        </w:p>
-                        <w:p>
-                          <w:pPr>
-                            <w:spacing w:after="200" w:before="0" w:line="275.9999942779541"/>
-                            <w:ind w:left="0" w:right="0" w:firstLine="0"/>
-                            <w:jc w:val="center"/>
-                            <w:textDirection w:val="btLr"/>
-                          </w:pPr>
-                          <w:r>
-                            <w:rPr>
-                              <w:rFonts w:ascii="Arial" w:cs="Arial" w:eastAsia="Arial" w:hAnsi="Arial"/>
-                              <w:b w:val="1"/>
-                              <w:i w:val="0"/>
-                              <w:smallCaps w:val="0"/>
-                              <w:strike w:val="0"/>
-                              <w:color w:val="000000"/>
-                              <w:sz w:val="28"/>
-                              <w:vertAlign w:val="baseline"/>
-                            </w:rPr>
-                          </w:r>
-                        </w:p>
-                        <w:p>
-                          <w:pPr>
-                            <w:spacing w:after="200" w:before="0" w:line="275.9999942779541"/>
-                            <w:ind w:left="0" w:right="0" w:firstLine="0"/>
-                            <w:jc w:val="left"/>
-                            <w:textDirection w:val="btLr"/>
-                          </w:pPr>
-                          <w:r>
-                            <w:rPr>
-                              <w:rFonts w:ascii="Arial" w:cs="Arial" w:eastAsia="Arial" w:hAnsi="Arial"/>
-                              <w:b w:val="1"/>
-                              <w:i w:val="0"/>
-                              <w:smallCaps w:val="0"/>
-                              <w:strike w:val="0"/>
-                              <w:color w:val="000000"/>
-                              <w:sz w:val="28"/>
-                              <w:vertAlign w:val="baseline"/>
-                            </w:rPr>
-                          </w:r>
-                        </w:p>
-                      </w:txbxContent>
-                    </wps:txbx>
-                    <wps:bodyPr anchorCtr="0" anchor="t" bIns="45700" lIns="91425" spcFirstLastPara="1" rIns="91425" wrap="square" tIns="45700">
-                      <a:noAutofit/>
-                    </wps:bodyPr>
-                  </wps:wsp>
-                </a:graphicData>
-              </a:graphic>
-            </wp:anchor>
-          </w:drawing>
-        </mc:Choice>
-        <mc:Fallback>
-          <w:drawing>
-            <wp:anchor allowOverlap="1" behindDoc="0" distB="0" distT="0" distL="114300" distR="114300" hidden="0" layoutInCell="1" locked="0" relativeHeight="0" simplePos="0">
-              <wp:simplePos x="0" y="0"/>
-              <wp:positionH relativeFrom="column">
-                <wp:posOffset>2654300</wp:posOffset>
-              </wp:positionH>
-              <wp:positionV relativeFrom="paragraph">
-                <wp:posOffset>165100</wp:posOffset>
-              </wp:positionV>
-              <wp:extent cx="5443537" cy="1204913"/>
-              <wp:effectExtent b="0" l="0" r="0" t="0"/>
-              <wp:wrapNone/>
-              <wp:docPr id="1" name="image4.png"/>
-              <a:graphic>
-                <a:graphicData uri="http://schemas.openxmlformats.org/drawingml/2006/picture">
-                  <pic:pic>
-                    <pic:nvPicPr>
-                      <pic:cNvPr id="0" name="image4.png"/>
-                      <pic:cNvPicPr preferRelativeResize="0"/>
-                    </pic:nvPicPr>
-                    <pic:blipFill>
-                      <a:blip r:embed="rId2"/>
-                      <a:srcRect/>
-                      <a:stretch>
-                        <a:fillRect/>
-                      </a:stretch>
-                    </pic:blipFill>
-                    <pic:spPr>
-                      <a:xfrm>
-                        <a:off x="0" y="0"/>
-                        <a:ext cx="5443537" cy="1204913"/>
-                      </a:xfrm>
-                      <a:prstGeom prst="rect"/>
-                      <a:ln/>
-                    </pic:spPr>
-                  </pic:pic>
-                </a:graphicData>
-              </a:graphic>
-            </wp:anchor>
-          </w:drawing>
-        </mc:Fallback>
-      </mc:AlternateContent>
-    </w:r>
+    <w:r/>
   </w:p>
   <w:p>
     <w:pPr>
@@ -1841,7 +1650,7 @@
     <w:r>
       <w:rPr/>
       <w:pict>
-        <v:shape id="WordPictureWatermark2" style="position:absolute;width:498.59999999999997pt;height:498.59999999999997pt;rotation:0;z-index:-503316481;mso-position-horizontal-relative:margin;mso-position-horizontal:center;mso-position-vertical-relative:margin;mso-position-vertical:center;" alt="" type="#_x0000_t75">
+        <v:shape stroked="f" id="WordPictureWatermark2" style="position:absolute;width:498.59999999999997pt;height:498.59999999999997pt;rotation:0;z-index:-503316481;mso-position-horizontal-relative:margin;mso-position-horizontal:center;mso-position-vertical-relative:margin;mso-position-vertical:center;" alt="" type="#_x0000_t75">
           <v:imagedata blacklevel="22938f" cropbottom="0f" cropleft="0f" cropright="0f" croptop="0f" gain="19661f" r:id="rId1" o:title="image7.png"/>
         </v:shape>
       </w:pict>
@@ -1890,198 +1699,7 @@
       <w:tab/>
       <w:tab/>
     </w:r>
-    <w:r>
-      <mc:AlternateContent>
-        <mc:Choice Requires="wpg">
-          <w:drawing>
-            <wp:anchor allowOverlap="1" behindDoc="0" distB="0" distT="0" distL="114300" distR="114300" hidden="0" layoutInCell="1" locked="0" relativeHeight="0" simplePos="0">
-              <wp:simplePos x="0" y="0"/>
-              <wp:positionH relativeFrom="column">
-                <wp:posOffset>1471613</wp:posOffset>
-              </wp:positionH>
-              <wp:positionV relativeFrom="paragraph">
-                <wp:posOffset>-180339</wp:posOffset>
-              </wp:positionV>
-              <wp:extent cx="5443537" cy="1204913"/>
-              <wp:effectExtent b="0" l="0" r="0" t="0"/>
-              <wp:wrapNone/>
-              <wp:docPr id="2" name=""/>
-              <a:graphic>
-                <a:graphicData uri="http://schemas.microsoft.com/office/word/2010/wordprocessingShape">
-                  <wps:wsp>
-                    <wps:cNvSpPr/>
-                    <wps:cNvPr id="2" name="Shape 2"/>
-                    <wps:spPr>
-                      <a:xfrm>
-                        <a:off x="2628994" y="3182306"/>
-                        <a:ext cx="5434012" cy="1195388"/>
-                      </a:xfrm>
-                      <a:prstGeom prst="rect">
-                        <a:avLst/>
-                      </a:prstGeom>
-                      <a:noFill/>
-                      <a:ln>
-                        <a:noFill/>
-                      </a:ln>
-                    </wps:spPr>
-                    <wps:txbx>
-                      <w:txbxContent>
-                        <w:p>
-                          <w:pPr>
-                            <w:spacing w:after="0" w:before="0" w:line="240"/>
-                            <w:ind w:left="0" w:right="0" w:firstLine="0"/>
-                            <w:jc w:val="center"/>
-                            <w:textDirection w:val="btLr"/>
-                          </w:pPr>
-                        </w:p>
-                        <w:p>
-                          <w:pPr>
-                            <w:spacing w:after="0" w:before="0" w:line="240"/>
-                            <w:ind w:left="0" w:right="0" w:firstLine="0"/>
-                            <w:jc w:val="center"/>
-                            <w:textDirection w:val="btLr"/>
-                          </w:pPr>
-                          <w:r>
-                            <w:rPr>
-                              <w:rFonts w:ascii="Arial" w:cs="Arial" w:eastAsia="Arial" w:hAnsi="Arial"/>
-                              <w:b w:val="1"/>
-                              <w:i w:val="0"/>
-                              <w:smallCaps w:val="0"/>
-                              <w:strike w:val="0"/>
-                              <w:color w:val="000000"/>
-                              <w:sz w:val="44"/>
-                              <w:vertAlign w:val="baseline"/>
-                            </w:rPr>
-                          </w:r>
-                        </w:p>
-                        <w:p>
-                          <w:pPr>
-                            <w:spacing w:after="0" w:before="0" w:line="240"/>
-                            <w:ind w:left="0" w:right="0" w:firstLine="0"/>
-                            <w:jc w:val="center"/>
-                            <w:textDirection w:val="btLr"/>
-                          </w:pPr>
-                          <w:r>
-                            <w:rPr>
-                              <w:rFonts w:ascii="Arial" w:cs="Arial" w:eastAsia="Arial" w:hAnsi="Arial"/>
-                              <w:b w:val="1"/>
-                              <w:i w:val="0"/>
-                              <w:smallCaps w:val="0"/>
-                              <w:strike w:val="0"/>
-                              <w:color w:val="000000"/>
-                              <w:sz w:val="32"/>
-                              <w:vertAlign w:val="baseline"/>
-                            </w:rPr>
-                          </w:r>
-                          <w:r>
-                            <w:rPr>
-                              <w:rFonts w:ascii="Arial" w:cs="Arial" w:eastAsia="Arial" w:hAnsi="Arial"/>
-                              <w:b w:val="1"/>
-                              <w:i w:val="0"/>
-                              <w:smallCaps w:val="0"/>
-                              <w:strike w:val="0"/>
-                              <w:color w:val="000000"/>
-                              <w:sz w:val="28"/>
-                              <w:vertAlign w:val="baseline"/>
-                            </w:rPr>
-                            <w:t xml:space="preserve">ALCALDÍA MUNICIPAL DE PUERTO BOYACÁ - BOYACA</w:t>
-                          </w:r>
-                        </w:p>
-                        <w:p>
-                          <w:pPr>
-                            <w:spacing w:after="200" w:before="0" w:line="275.9999942779541"/>
-                            <w:ind w:left="0" w:right="0" w:firstLine="0"/>
-                            <w:jc w:val="center"/>
-                            <w:textDirection w:val="btLr"/>
-                          </w:pPr>
-                          <w:r>
-                            <w:rPr>
-                              <w:rFonts w:ascii="Arial" w:cs="Arial" w:eastAsia="Arial" w:hAnsi="Arial"/>
-                              <w:b w:val="1"/>
-                              <w:i w:val="0"/>
-                              <w:smallCaps w:val="0"/>
-                              <w:strike w:val="0"/>
-                              <w:color w:val="000000"/>
-                              <w:sz w:val="28"/>
-                              <w:vertAlign w:val="baseline"/>
-                            </w:rPr>
-                          </w:r>
-                        </w:p>
-                        <w:p>
-                          <w:pPr>
-                            <w:spacing w:after="200" w:before="0" w:line="275.9999942779541"/>
-                            <w:ind w:left="0" w:right="0" w:firstLine="0"/>
-                            <w:jc w:val="left"/>
-                            <w:textDirection w:val="btLr"/>
-                          </w:pPr>
-                          <w:r>
-                            <w:rPr>
-                              <w:rFonts w:ascii="Arial" w:cs="Arial" w:eastAsia="Arial" w:hAnsi="Arial"/>
-                              <w:b w:val="1"/>
-                              <w:i w:val="0"/>
-                              <w:smallCaps w:val="0"/>
-                              <w:strike w:val="0"/>
-                              <w:color w:val="000000"/>
-                              <w:sz w:val="28"/>
-                              <w:vertAlign w:val="baseline"/>
-                            </w:rPr>
-                          </w:r>
-                        </w:p>
-                      </w:txbxContent>
-                    </wps:txbx>
-                    <wps:bodyPr anchorCtr="0" anchor="t" bIns="45700" lIns="91425" spcFirstLastPara="1" rIns="91425" wrap="square" tIns="45700">
-                      <a:noAutofit/>
-                    </wps:bodyPr>
-                  </wps:wsp>
-                </a:graphicData>
-              </a:graphic>
-            </wp:anchor>
-          </w:drawing>
-        </mc:Choice>
-        <mc:Fallback>
-          <w:drawing>
-            <wp:anchor allowOverlap="1" behindDoc="0" distB="0" distT="0" distL="114300" distR="114300" hidden="0" layoutInCell="1" locked="0" relativeHeight="0" simplePos="0">
-              <wp:simplePos x="0" y="0"/>
-              <wp:positionH relativeFrom="column">
-                <wp:posOffset>1471613</wp:posOffset>
-              </wp:positionH>
-              <wp:positionV relativeFrom="paragraph">
-                <wp:posOffset>-180339</wp:posOffset>
-              </wp:positionV>
-              <wp:extent cx="5443537" cy="1204913"/>
-              <wp:effectExtent b="0" l="0" r="0" t="0"/>
-              <wp:wrapNone/>
-              <wp:docPr id="2" name="image5.png"/>
-              <a:graphic>
-                <a:graphicData uri="http://schemas.openxmlformats.org/drawingml/2006/picture">
-                  <pic:pic>
-                    <pic:nvPicPr>
-                      <pic:cNvPr id="0" name="image5.png"/>
-                      <pic:cNvPicPr preferRelativeResize="0"/>
-                    </pic:nvPicPr>
-                    <pic:blipFill>
-                      <a:blip r:embed="rId3"/>
-                      <a:srcRect/>
-                      <a:stretch>
-                        <a:fillRect/>
-                      </a:stretch>
-                    </pic:blipFill>
-                    <pic:spPr>
-                      <a:xfrm>
-                        <a:off x="0" y="0"/>
-                        <a:ext cx="5443537" cy="1204913"/>
-                      </a:xfrm>
-                      <a:prstGeom prst="rect"/>
-                      <a:ln/>
-                    </pic:spPr>
-                  </pic:pic>
-                </a:graphicData>
-              </a:graphic>
-            </wp:anchor>
-          </w:drawing>
-        </mc:Fallback>
-      </mc:AlternateContent>
-    </w:r>
+    <w:r/>
   </w:p>
 </w:hdr>
 </file>

</xml_diff>

<commit_message>
fix(actas): restaurar título del encabezado + firma y QR en el documento
- El título "ALCALDÍA MUNICIPAL..." estaba dentro del mc:AlternateContent del
  encabezado; se conserva (antes lo quité por error creyendo que era el recuadro).
- El recuadro real era el borde de la marca de agua -> stroked="f".
- Firma del alcalde sobre "Vo Bo. Alcalde Municipal" (${firma_alcalde}) y QR de
  verificación en la celda FIRMA, con tamaños moderados y holgura de márgenes.

Co-Authored-By: Claude Sonnet 4.6 <noreply@anthropic.com>
</commit_message>
<xml_diff>
--- a/resources/document-templates/acta_necesidad.docx
+++ b/resources/document-templates/acta_necesidad.docx
@@ -358,6 +358,12 @@
                 <w:rtl w:val="0"/>
               </w:rPr>
             </w:r>
+            <w:r>
+              <w:rPr>
+                <w:rFonts w:ascii="Arial Narrow" w:cs="Arial Narrow" w:eastAsia="Arial Narrow" w:hAnsi="Arial Narrow"/>
+              </w:rPr>
+              <w:t xml:space="preserve">${qr_verificacion}</w:t>
+            </w:r>
           </w:p>
         </w:tc>
       </w:tr>
@@ -1085,7 +1091,9 @@
                 <w:szCs w:val="16"/>
                 <w:rtl w:val="0"/>
               </w:rPr>
-              <w:t xml:space="preserve">Vo Bo. Alcalde Municipal</w:t>
+              <w:t xml:space="preserve">${firma_alcalde}</w:t>
+              <w:br/>
+              <w:t xml:space="preserve">${label_alcalde}</w:t>
             </w:r>
           </w:p>
         </w:tc>
@@ -1262,48 +1270,7 @@
           <w:rtl w:val="0"/>
         </w:rPr>
       </w:r>
-      <w:r>
-        <w:drawing>
-          <wp:anchor allowOverlap="1" behindDoc="0" distB="114300" distT="114300" distL="114300" distR="114300" hidden="0" layoutInCell="1" locked="0" relativeHeight="0" simplePos="0">
-            <wp:simplePos x="0" y="0"/>
-            <wp:positionH relativeFrom="column">
-              <wp:posOffset>2181225</wp:posOffset>
-            </wp:positionH>
-            <wp:positionV relativeFrom="paragraph">
-              <wp:posOffset>3228975</wp:posOffset>
-            </wp:positionV>
-            <wp:extent cx="1738313" cy="1410672"/>
-            <wp:effectExtent b="0" l="0" r="0" t="0"/>
-            <wp:wrapNone/>
-            <wp:docPr id="4" name="image2.png"/>
-            <a:graphic>
-              <a:graphicData uri="http://schemas.openxmlformats.org/drawingml/2006/picture">
-                <pic:pic>
-                  <pic:nvPicPr>
-                    <pic:cNvPr id="0" name="image2.png"/>
-                    <pic:cNvPicPr preferRelativeResize="0"/>
-                  </pic:nvPicPr>
-                  <pic:blipFill>
-                    <a:blip r:embed="rId6"/>
-                    <a:srcRect b="0" l="0" r="0" t="0"/>
-                    <a:stretch>
-                      <a:fillRect/>
-                    </a:stretch>
-                  </pic:blipFill>
-                  <pic:spPr>
-                    <a:xfrm>
-                      <a:off x="0" y="0"/>
-                      <a:ext cx="1738313" cy="1410672"/>
-                    </a:xfrm>
-                    <a:prstGeom prst="rect"/>
-                    <a:ln/>
-                  </pic:spPr>
-                </pic:pic>
-              </a:graphicData>
-            </a:graphic>
-          </wp:anchor>
-        </w:drawing>
-      </w:r>
+      <w:r/>
     </w:p>
     <w:sectPr>
       <w:headerReference r:id="rId7" w:type="default"/>
@@ -1311,7 +1278,7 @@
       <w:footerReference r:id="rId9" w:type="default"/>
       <w:footerReference r:id="rId10" w:type="first"/>
       <w:pgSz w:h="12240" w:w="15840" w:orient="landscape"/>
-      <w:pgMar w:bottom="1417.3228346456694" w:top="1417.3228346456694" w:left="1417.3228346456694" w:right="1417.3228346456694" w:header="284" w:footer="1304"/>
+      <w:pgMar w:bottom="200" w:top="340" w:left="1417.3228346456694" w:right="1417.3228346456694" w:header="284" w:footer="1304"/>
       <w:pgNumType w:start="1"/>
       <w:titlePg w:val="1"/>
     </w:sectPr>
@@ -1435,7 +1402,198 @@
         <w:rtl w:val="0"/>
       </w:rPr>
     </w:r>
-    <w:r/>
+    <w:r>
+      <mc:AlternateContent>
+        <mc:Choice Requires="wpg">
+          <w:drawing>
+            <wp:anchor allowOverlap="1" behindDoc="0" distB="0" distT="0" distL="114300" distR="114300" hidden="0" layoutInCell="1" locked="0" relativeHeight="0" simplePos="0">
+              <wp:simplePos x="0" y="0"/>
+              <wp:positionH relativeFrom="column">
+                <wp:posOffset>2654300</wp:posOffset>
+              </wp:positionH>
+              <wp:positionV relativeFrom="paragraph">
+                <wp:posOffset>165100</wp:posOffset>
+              </wp:positionV>
+              <wp:extent cx="5443537" cy="1204913"/>
+              <wp:effectExtent b="0" l="0" r="0" t="0"/>
+              <wp:wrapNone/>
+              <wp:docPr id="1" name=""/>
+              <a:graphic>
+                <a:graphicData uri="http://schemas.microsoft.com/office/word/2010/wordprocessingShape">
+                  <wps:wsp>
+                    <wps:cNvSpPr/>
+                    <wps:cNvPr id="2" name="Shape 2"/>
+                    <wps:spPr>
+                      <a:xfrm>
+                        <a:off x="2628994" y="3182306"/>
+                        <a:ext cx="5434012" cy="1195388"/>
+                      </a:xfrm>
+                      <a:prstGeom prst="rect">
+                        <a:avLst/>
+                      </a:prstGeom>
+                      <a:noFill/>
+                      <a:ln>
+                        <a:noFill/>
+                      </a:ln>
+                    </wps:spPr>
+                    <wps:txbx>
+                      <w:txbxContent>
+                        <w:p>
+                          <w:pPr>
+                            <w:spacing w:after="0" w:before="0" w:line="240"/>
+                            <w:ind w:left="0" w:right="0" w:firstLine="0"/>
+                            <w:jc w:val="center"/>
+                            <w:textDirection w:val="btLr"/>
+                          </w:pPr>
+                        </w:p>
+                        <w:p>
+                          <w:pPr>
+                            <w:spacing w:after="0" w:before="0" w:line="240"/>
+                            <w:ind w:left="0" w:right="0" w:firstLine="0"/>
+                            <w:jc w:val="center"/>
+                            <w:textDirection w:val="btLr"/>
+                          </w:pPr>
+                          <w:r>
+                            <w:rPr>
+                              <w:rFonts w:ascii="Arial" w:cs="Arial" w:eastAsia="Arial" w:hAnsi="Arial"/>
+                              <w:b w:val="1"/>
+                              <w:i w:val="0"/>
+                              <w:smallCaps w:val="0"/>
+                              <w:strike w:val="0"/>
+                              <w:color w:val="000000"/>
+                              <w:sz w:val="44"/>
+                              <w:vertAlign w:val="baseline"/>
+                            </w:rPr>
+                          </w:r>
+                        </w:p>
+                        <w:p>
+                          <w:pPr>
+                            <w:spacing w:after="0" w:before="0" w:line="240"/>
+                            <w:ind w:left="0" w:right="0" w:firstLine="0"/>
+                            <w:jc w:val="center"/>
+                            <w:textDirection w:val="btLr"/>
+                          </w:pPr>
+                          <w:r>
+                            <w:rPr>
+                              <w:rFonts w:ascii="Arial" w:cs="Arial" w:eastAsia="Arial" w:hAnsi="Arial"/>
+                              <w:b w:val="1"/>
+                              <w:i w:val="0"/>
+                              <w:smallCaps w:val="0"/>
+                              <w:strike w:val="0"/>
+                              <w:color w:val="000000"/>
+                              <w:sz w:val="32"/>
+                              <w:vertAlign w:val="baseline"/>
+                            </w:rPr>
+                          </w:r>
+                          <w:r>
+                            <w:rPr>
+                              <w:rFonts w:ascii="Arial" w:cs="Arial" w:eastAsia="Arial" w:hAnsi="Arial"/>
+                              <w:b w:val="1"/>
+                              <w:i w:val="0"/>
+                              <w:smallCaps w:val="0"/>
+                              <w:strike w:val="0"/>
+                              <w:color w:val="000000"/>
+                              <w:sz w:val="28"/>
+                              <w:vertAlign w:val="baseline"/>
+                            </w:rPr>
+                            <w:t xml:space="preserve">ALCALDÍA MUNICIPAL DE PUERTO BOYACÁ - BOYACA</w:t>
+                          </w:r>
+                        </w:p>
+                        <w:p>
+                          <w:pPr>
+                            <w:spacing w:after="200" w:before="0" w:line="275.9999942779541"/>
+                            <w:ind w:left="0" w:right="0" w:firstLine="0"/>
+                            <w:jc w:val="center"/>
+                            <w:textDirection w:val="btLr"/>
+                          </w:pPr>
+                          <w:r>
+                            <w:rPr>
+                              <w:rFonts w:ascii="Arial" w:cs="Arial" w:eastAsia="Arial" w:hAnsi="Arial"/>
+                              <w:b w:val="1"/>
+                              <w:i w:val="0"/>
+                              <w:smallCaps w:val="0"/>
+                              <w:strike w:val="0"/>
+                              <w:color w:val="000000"/>
+                              <w:sz w:val="28"/>
+                              <w:vertAlign w:val="baseline"/>
+                            </w:rPr>
+                          </w:r>
+                        </w:p>
+                        <w:p>
+                          <w:pPr>
+                            <w:spacing w:after="200" w:before="0" w:line="275.9999942779541"/>
+                            <w:ind w:left="0" w:right="0" w:firstLine="0"/>
+                            <w:jc w:val="left"/>
+                            <w:textDirection w:val="btLr"/>
+                          </w:pPr>
+                          <w:r>
+                            <w:rPr>
+                              <w:rFonts w:ascii="Arial" w:cs="Arial" w:eastAsia="Arial" w:hAnsi="Arial"/>
+                              <w:b w:val="1"/>
+                              <w:i w:val="0"/>
+                              <w:smallCaps w:val="0"/>
+                              <w:strike w:val="0"/>
+                              <w:color w:val="000000"/>
+                              <w:sz w:val="28"/>
+                              <w:vertAlign w:val="baseline"/>
+                            </w:rPr>
+                          </w:r>
+                        </w:p>
+                      </w:txbxContent>
+                    </wps:txbx>
+                    <wps:bodyPr anchorCtr="0" anchor="t" bIns="45700" lIns="91425" spcFirstLastPara="1" rIns="91425" wrap="square" tIns="45700">
+                      <a:noAutofit/>
+                    </wps:bodyPr>
+                  </wps:wsp>
+                </a:graphicData>
+              </a:graphic>
+            </wp:anchor>
+          </w:drawing>
+        </mc:Choice>
+        <mc:Fallback>
+          <w:drawing>
+            <wp:anchor allowOverlap="1" behindDoc="0" distB="0" distT="0" distL="114300" distR="114300" hidden="0" layoutInCell="1" locked="0" relativeHeight="0" simplePos="0">
+              <wp:simplePos x="0" y="0"/>
+              <wp:positionH relativeFrom="column">
+                <wp:posOffset>2654300</wp:posOffset>
+              </wp:positionH>
+              <wp:positionV relativeFrom="paragraph">
+                <wp:posOffset>165100</wp:posOffset>
+              </wp:positionV>
+              <wp:extent cx="5443537" cy="1204913"/>
+              <wp:effectExtent b="0" l="0" r="0" t="0"/>
+              <wp:wrapNone/>
+              <wp:docPr id="1" name="image4.png"/>
+              <a:graphic>
+                <a:graphicData uri="http://schemas.openxmlformats.org/drawingml/2006/picture">
+                  <pic:pic>
+                    <pic:nvPicPr>
+                      <pic:cNvPr id="0" name="image4.png"/>
+                      <pic:cNvPicPr preferRelativeResize="0"/>
+                    </pic:nvPicPr>
+                    <pic:blipFill>
+                      <a:blip r:embed="rId2"/>
+                      <a:srcRect/>
+                      <a:stretch>
+                        <a:fillRect/>
+                      </a:stretch>
+                    </pic:blipFill>
+                    <pic:spPr>
+                      <a:xfrm>
+                        <a:off x="0" y="0"/>
+                        <a:ext cx="5443537" cy="1204913"/>
+                      </a:xfrm>
+                      <a:prstGeom prst="rect"/>
+                      <a:ln/>
+                    </pic:spPr>
+                  </pic:pic>
+                </a:graphicData>
+              </a:graphic>
+            </wp:anchor>
+          </w:drawing>
+        </mc:Fallback>
+      </mc:AlternateContent>
+    </w:r>
   </w:p>
   <w:p>
     <w:pPr>
@@ -1699,7 +1857,198 @@
       <w:tab/>
       <w:tab/>
     </w:r>
-    <w:r/>
+    <w:r>
+      <mc:AlternateContent>
+        <mc:Choice Requires="wpg">
+          <w:drawing>
+            <wp:anchor allowOverlap="1" behindDoc="0" distB="0" distT="0" distL="114300" distR="114300" hidden="0" layoutInCell="1" locked="0" relativeHeight="0" simplePos="0">
+              <wp:simplePos x="0" y="0"/>
+              <wp:positionH relativeFrom="column">
+                <wp:posOffset>1471613</wp:posOffset>
+              </wp:positionH>
+              <wp:positionV relativeFrom="paragraph">
+                <wp:posOffset>-180339</wp:posOffset>
+              </wp:positionV>
+              <wp:extent cx="5443537" cy="1204913"/>
+              <wp:effectExtent b="0" l="0" r="0" t="0"/>
+              <wp:wrapNone/>
+              <wp:docPr id="2" name=""/>
+              <a:graphic>
+                <a:graphicData uri="http://schemas.microsoft.com/office/word/2010/wordprocessingShape">
+                  <wps:wsp>
+                    <wps:cNvSpPr/>
+                    <wps:cNvPr id="2" name="Shape 2"/>
+                    <wps:spPr>
+                      <a:xfrm>
+                        <a:off x="2628994" y="3182306"/>
+                        <a:ext cx="5434012" cy="1195388"/>
+                      </a:xfrm>
+                      <a:prstGeom prst="rect">
+                        <a:avLst/>
+                      </a:prstGeom>
+                      <a:noFill/>
+                      <a:ln>
+                        <a:noFill/>
+                      </a:ln>
+                    </wps:spPr>
+                    <wps:txbx>
+                      <w:txbxContent>
+                        <w:p>
+                          <w:pPr>
+                            <w:spacing w:after="0" w:before="0" w:line="240"/>
+                            <w:ind w:left="0" w:right="0" w:firstLine="0"/>
+                            <w:jc w:val="center"/>
+                            <w:textDirection w:val="btLr"/>
+                          </w:pPr>
+                        </w:p>
+                        <w:p>
+                          <w:pPr>
+                            <w:spacing w:after="0" w:before="0" w:line="240"/>
+                            <w:ind w:left="0" w:right="0" w:firstLine="0"/>
+                            <w:jc w:val="center"/>
+                            <w:textDirection w:val="btLr"/>
+                          </w:pPr>
+                          <w:r>
+                            <w:rPr>
+                              <w:rFonts w:ascii="Arial" w:cs="Arial" w:eastAsia="Arial" w:hAnsi="Arial"/>
+                              <w:b w:val="1"/>
+                              <w:i w:val="0"/>
+                              <w:smallCaps w:val="0"/>
+                              <w:strike w:val="0"/>
+                              <w:color w:val="000000"/>
+                              <w:sz w:val="44"/>
+                              <w:vertAlign w:val="baseline"/>
+                            </w:rPr>
+                          </w:r>
+                        </w:p>
+                        <w:p>
+                          <w:pPr>
+                            <w:spacing w:after="0" w:before="0" w:line="240"/>
+                            <w:ind w:left="0" w:right="0" w:firstLine="0"/>
+                            <w:jc w:val="center"/>
+                            <w:textDirection w:val="btLr"/>
+                          </w:pPr>
+                          <w:r>
+                            <w:rPr>
+                              <w:rFonts w:ascii="Arial" w:cs="Arial" w:eastAsia="Arial" w:hAnsi="Arial"/>
+                              <w:b w:val="1"/>
+                              <w:i w:val="0"/>
+                              <w:smallCaps w:val="0"/>
+                              <w:strike w:val="0"/>
+                              <w:color w:val="000000"/>
+                              <w:sz w:val="32"/>
+                              <w:vertAlign w:val="baseline"/>
+                            </w:rPr>
+                          </w:r>
+                          <w:r>
+                            <w:rPr>
+                              <w:rFonts w:ascii="Arial" w:cs="Arial" w:eastAsia="Arial" w:hAnsi="Arial"/>
+                              <w:b w:val="1"/>
+                              <w:i w:val="0"/>
+                              <w:smallCaps w:val="0"/>
+                              <w:strike w:val="0"/>
+                              <w:color w:val="000000"/>
+                              <w:sz w:val="28"/>
+                              <w:vertAlign w:val="baseline"/>
+                            </w:rPr>
+                            <w:t xml:space="preserve">ALCALDÍA MUNICIPAL DE PUERTO BOYACÁ - BOYACA</w:t>
+                          </w:r>
+                        </w:p>
+                        <w:p>
+                          <w:pPr>
+                            <w:spacing w:after="200" w:before="0" w:line="275.9999942779541"/>
+                            <w:ind w:left="0" w:right="0" w:firstLine="0"/>
+                            <w:jc w:val="center"/>
+                            <w:textDirection w:val="btLr"/>
+                          </w:pPr>
+                          <w:r>
+                            <w:rPr>
+                              <w:rFonts w:ascii="Arial" w:cs="Arial" w:eastAsia="Arial" w:hAnsi="Arial"/>
+                              <w:b w:val="1"/>
+                              <w:i w:val="0"/>
+                              <w:smallCaps w:val="0"/>
+                              <w:strike w:val="0"/>
+                              <w:color w:val="000000"/>
+                              <w:sz w:val="28"/>
+                              <w:vertAlign w:val="baseline"/>
+                            </w:rPr>
+                          </w:r>
+                        </w:p>
+                        <w:p>
+                          <w:pPr>
+                            <w:spacing w:after="200" w:before="0" w:line="275.9999942779541"/>
+                            <w:ind w:left="0" w:right="0" w:firstLine="0"/>
+                            <w:jc w:val="left"/>
+                            <w:textDirection w:val="btLr"/>
+                          </w:pPr>
+                          <w:r>
+                            <w:rPr>
+                              <w:rFonts w:ascii="Arial" w:cs="Arial" w:eastAsia="Arial" w:hAnsi="Arial"/>
+                              <w:b w:val="1"/>
+                              <w:i w:val="0"/>
+                              <w:smallCaps w:val="0"/>
+                              <w:strike w:val="0"/>
+                              <w:color w:val="000000"/>
+                              <w:sz w:val="28"/>
+                              <w:vertAlign w:val="baseline"/>
+                            </w:rPr>
+                          </w:r>
+                        </w:p>
+                      </w:txbxContent>
+                    </wps:txbx>
+                    <wps:bodyPr anchorCtr="0" anchor="t" bIns="45700" lIns="91425" spcFirstLastPara="1" rIns="91425" wrap="square" tIns="45700">
+                      <a:noAutofit/>
+                    </wps:bodyPr>
+                  </wps:wsp>
+                </a:graphicData>
+              </a:graphic>
+            </wp:anchor>
+          </w:drawing>
+        </mc:Choice>
+        <mc:Fallback>
+          <w:drawing>
+            <wp:anchor allowOverlap="1" behindDoc="0" distB="0" distT="0" distL="114300" distR="114300" hidden="0" layoutInCell="1" locked="0" relativeHeight="0" simplePos="0">
+              <wp:simplePos x="0" y="0"/>
+              <wp:positionH relativeFrom="column">
+                <wp:posOffset>1471613</wp:posOffset>
+              </wp:positionH>
+              <wp:positionV relativeFrom="paragraph">
+                <wp:posOffset>-180339</wp:posOffset>
+              </wp:positionV>
+              <wp:extent cx="5443537" cy="1204913"/>
+              <wp:effectExtent b="0" l="0" r="0" t="0"/>
+              <wp:wrapNone/>
+              <wp:docPr id="2" name="image5.png"/>
+              <a:graphic>
+                <a:graphicData uri="http://schemas.openxmlformats.org/drawingml/2006/picture">
+                  <pic:pic>
+                    <pic:nvPicPr>
+                      <pic:cNvPr id="0" name="image5.png"/>
+                      <pic:cNvPicPr preferRelativeResize="0"/>
+                    </pic:nvPicPr>
+                    <pic:blipFill>
+                      <a:blip r:embed="rId3"/>
+                      <a:srcRect/>
+                      <a:stretch>
+                        <a:fillRect/>
+                      </a:stretch>
+                    </pic:blipFill>
+                    <pic:spPr>
+                      <a:xfrm>
+                        <a:off x="0" y="0"/>
+                        <a:ext cx="5443537" cy="1204913"/>
+                      </a:xfrm>
+                      <a:prstGeom prst="rect"/>
+                      <a:ln/>
+                    </pic:spPr>
+                  </pic:pic>
+                </a:graphicData>
+              </a:graphic>
+            </wp:anchor>
+          </w:drawing>
+        </mc:Fallback>
+      </mc:AlternateContent>
+    </w:r>
   </w:p>
 </w:hdr>
 </file>

</xml_diff>

<commit_message>
feat(actas): QR de verificación como imagen flotante en la celda FIRMA
El QR se inserta como imagen anclada (wrapNone), igual que la firma del
alcalde, por lo que ya NO crece la tabla ni empuja el contenido a una
segunda hoja. Antes el QR inline forzaba página adicional.

- insertarQrFlotante(): embebe media/qr_acta.png, crea la relación y
  ancla el dibujo en la celda FIRMA de la fila de datos.
- Plantilla oficial con logo nuevo en todas las páginas, marca de agua
  sin borde y firma anclada sobre "Vo Bo. Alcalde Municipal".

Co-Authored-By: Claude Opus 4.8 <noreply@anthropic.com>
Claude-Session: https://claude.ai/code/session_011hGRehV3P86FbzZ9rGGmos
</commit_message>
<xml_diff>
--- a/resources/document-templates/acta_necesidad.docx
+++ b/resources/document-templates/acta_necesidad.docx
@@ -358,12 +358,6 @@
                 <w:rtl w:val="0"/>
               </w:rPr>
             </w:r>
-            <w:r>
-              <w:rPr>
-                <w:rFonts w:ascii="Arial Narrow" w:cs="Arial Narrow" w:eastAsia="Arial Narrow" w:hAnsi="Arial Narrow"/>
-              </w:rPr>
-              <w:t xml:space="preserve">${qr_verificacion}</w:t>
-            </w:r>
           </w:p>
         </w:tc>
       </w:tr>
@@ -1091,9 +1085,7 @@
                 <w:szCs w:val="16"/>
                 <w:rtl w:val="0"/>
               </w:rPr>
-              <w:t xml:space="preserve">${firma_alcalde}</w:t>
-              <w:br/>
-              <w:t xml:space="preserve">${label_alcalde}</w:t>
+              <w:t xml:space="preserve">Vo Bo. Alcalde Municipal</w:t>
             </w:r>
           </w:p>
         </w:tc>
@@ -1270,7 +1262,48 @@
           <w:rtl w:val="0"/>
         </w:rPr>
       </w:r>
-      <w:r/>
+      <w:r>
+        <w:drawing>
+          <wp:anchor allowOverlap="1" behindDoc="0" distB="114300" distT="114300" distL="114300" distR="114300" hidden="0" layoutInCell="1" locked="0" relativeHeight="0" simplePos="0">
+            <wp:simplePos x="0" y="0"/>
+            <wp:positionH relativeFrom="column">
+              <wp:posOffset>2181225</wp:posOffset>
+            </wp:positionH>
+            <wp:positionV relativeFrom="paragraph">
+              <wp:posOffset>3228975</wp:posOffset>
+            </wp:positionV>
+            <wp:extent cx="1738313" cy="1410672"/>
+            <wp:effectExtent b="0" l="0" r="0" t="0"/>
+            <wp:wrapNone/>
+            <wp:docPr id="4" name="image2.png"/>
+            <a:graphic>
+              <a:graphicData uri="http://schemas.openxmlformats.org/drawingml/2006/picture">
+                <pic:pic>
+                  <pic:nvPicPr>
+                    <pic:cNvPr id="0" name="image2.png"/>
+                    <pic:cNvPicPr preferRelativeResize="0"/>
+                  </pic:nvPicPr>
+                  <pic:blipFill>
+                    <a:blip r:embed="rId6"/>
+                    <a:srcRect b="0" l="0" r="0" t="0"/>
+                    <a:stretch>
+                      <a:fillRect/>
+                    </a:stretch>
+                  </pic:blipFill>
+                  <pic:spPr>
+                    <a:xfrm>
+                      <a:off x="0" y="0"/>
+                      <a:ext cx="1738313" cy="1410672"/>
+                    </a:xfrm>
+                    <a:prstGeom prst="rect"/>
+                    <a:ln/>
+                  </pic:spPr>
+                </pic:pic>
+              </a:graphicData>
+            </a:graphic>
+          </wp:anchor>
+        </w:drawing>
+      </w:r>
     </w:p>
     <w:sectPr>
       <w:headerReference r:id="rId7" w:type="default"/>
@@ -1278,7 +1311,7 @@
       <w:footerReference r:id="rId9" w:type="default"/>
       <w:footerReference r:id="rId10" w:type="first"/>
       <w:pgSz w:h="12240" w:w="15840" w:orient="landscape"/>
-      <w:pgMar w:bottom="200" w:top="340" w:left="1417.3228346456694" w:right="1417.3228346456694" w:header="284" w:footer="1304"/>
+      <w:pgMar w:bottom="1417.3228346456694" w:top="1417.3228346456694" w:left="1417.3228346456694" w:right="1417.3228346456694" w:header="284" w:footer="1304"/>
       <w:pgNumType w:start="1"/>
       <w:titlePg w:val="1"/>
     </w:sectPr>
@@ -1353,54 +1386,65 @@
 <w:hdr xmlns:mc="http://schemas.openxmlformats.org/markup-compatibility/2006" xmlns:o="urn:schemas-microsoft-com:office:office" xmlns:r="http://schemas.openxmlformats.org/officeDocument/2006/relationships" xmlns:m="http://schemas.openxmlformats.org/officeDocument/2006/math" xmlns:v="urn:schemas-microsoft-com:vml" xmlns:wp="http://schemas.openxmlformats.org/drawingml/2006/wordprocessingDrawing" xmlns:w10="urn:schemas-microsoft-com:office:word" xmlns:w="http://schemas.openxmlformats.org/wordprocessingml/2006/main" xmlns:wne="http://schemas.microsoft.com/office/word/2006/wordml" xmlns:sl="http://schemas.openxmlformats.org/schemaLibrary/2006/main" xmlns:a="http://schemas.openxmlformats.org/drawingml/2006/main" xmlns:pic="http://schemas.openxmlformats.org/drawingml/2006/picture" xmlns:c="http://schemas.openxmlformats.org/drawingml/2006/chart" xmlns:lc="http://schemas.openxmlformats.org/drawingml/2006/lockedCanvas" xmlns:dgm="http://schemas.openxmlformats.org/drawingml/2006/diagram" xmlns:wps="http://schemas.microsoft.com/office/word/2010/wordprocessingShape" xmlns:wpg="http://schemas.microsoft.com/office/word/2010/wordprocessingGroup" xmlns:w14="http://schemas.microsoft.com/office/word/2010/wordml" xmlns:w15="http://schemas.microsoft.com/office/word/2012/wordml" xmlns:w16="http://schemas.microsoft.com/office/word/2018/wordml" xmlns:w16cex="http://schemas.microsoft.com/office/word/2018/wordml/cex" xmlns:w16cid="http://schemas.microsoft.com/office/word/2016/wordml/cid" xmlns="http://schemas.microsoft.com/office/tasks/2019/documenttasks" xmlns:cr="http://schemas.microsoft.com/office/comments/2020/reactions">
   <w:p>
     <w:pPr>
-      <w:keepNext w:val="0"/>
-      <w:keepLines w:val="0"/>
-      <w:pageBreakBefore w:val="0"/>
-      <w:widowControl w:val="1"/>
-      <w:pBdr>
-        <w:top w:space="0" w:sz="0" w:val="nil"/>
-        <w:left w:space="0" w:sz="0" w:val="nil"/>
-        <w:bottom w:space="0" w:sz="0" w:val="nil"/>
-        <w:right w:space="0" w:sz="0" w:val="nil"/>
-        <w:between w:space="0" w:sz="0" w:val="nil"/>
-      </w:pBdr>
-      <w:shd w:fill="auto" w:val="clear"/>
       <w:tabs>
         <w:tab w:val="center" w:leader="none" w:pos="4252"/>
         <w:tab w:val="right" w:leader="none" w:pos="8504"/>
         <w:tab w:val="left" w:leader="none" w:pos="3570"/>
       </w:tabs>
-      <w:spacing w:after="0" w:before="0" w:line="240" w:lineRule="auto"/>
-      <w:ind w:left="0" w:right="0" w:firstLine="0"/>
-      <w:jc w:val="left"/>
-      <w:rPr>
-        <w:rFonts w:ascii="Calibri" w:cs="Calibri" w:eastAsia="Calibri" w:hAnsi="Calibri"/>
-        <w:b w:val="0"/>
-        <w:bCs w:val="0"/>
-        <w:i w:val="0"/>
-        <w:iCs w:val="0"/>
-        <w:smallCaps w:val="0"/>
-        <w:strike w:val="0"/>
-        <w:color w:val="000000"/>
-        <w:sz w:val="22"/>
-        <w:szCs w:val="22"/>
-        <w:u w:val="none"/>
-        <w:shd w:fill="auto" w:val="clear"/>
-        <w:vertAlign w:val="baseline"/>
-      </w:rPr>
+      <w:spacing w:after="0" w:line="240" w:lineRule="auto"/>
+      <w:rPr/>
     </w:pPr>
     <w:r>
       <w:rPr/>
       <w:pict>
-        <v:shape stroked="f" id="WordPictureWatermark1" style="position:absolute;width:498.59999999999997pt;height:498.59999999999997pt;rotation:0;z-index:-503316481;mso-position-horizontal-relative:margin;mso-position-horizontal:center;mso-position-vertical-relative:margin;mso-position-vertical:center;" alt="" type="#_x0000_t75">
-          <v:imagedata blacklevel="22938f" cropbottom="0f" cropleft="0f" cropright="0f" croptop="0f" gain="19661f" r:id="rId1" o:title="image6.png"/>
+        <v:shape stroked="f" id="WordPictureWatermark2" style="position:absolute;width:498.59999999999997pt;height:498.59999999999997pt;rotation:0;z-index:-503316481;mso-position-horizontal-relative:margin;mso-position-horizontal:center;mso-position-vertical-relative:margin;mso-position-vertical:center;" alt="" type="#_x0000_t75">
+          <v:imagedata blacklevel="22938f" cropbottom="0f" cropleft="0f" cropright="0f" croptop="0f" gain="19661f" r:id="rId1" o:title="image7.png"/>
         </v:shape>
       </w:pict>
+    </w:r>
+    <w:r>
+      <w:rPr/>
+      <w:drawing>
+        <wp:inline distB="0" distT="0" distL="0" distR="0">
+          <wp:extent cx="1169803" cy="976110"/>
+          <wp:effectExtent b="0" l="0" r="0" t="0"/>
+          <wp:docPr id="5" name="image1.png"/>
+          <a:graphic>
+            <a:graphicData uri="http://schemas.openxmlformats.org/drawingml/2006/picture">
+              <pic:pic>
+                <pic:nvPicPr>
+                  <pic:cNvPr id="0" name="image1.png"/>
+                  <pic:cNvPicPr preferRelativeResize="0"/>
+                </pic:nvPicPr>
+                <pic:blipFill>
+                  <a:blip r:embed="rId2"/>
+                  <a:srcRect b="8279" l="0" r="0" t="8279"/>
+                  <a:stretch>
+                    <a:fillRect/>
+                  </a:stretch>
+                </pic:blipFill>
+                <pic:spPr>
+                  <a:xfrm>
+                    <a:off x="0" y="0"/>
+                    <a:ext cx="1169803" cy="976110"/>
+                  </a:xfrm>
+                  <a:prstGeom prst="rect"/>
+                  <a:ln/>
+                </pic:spPr>
+              </pic:pic>
+            </a:graphicData>
+          </a:graphic>
+        </wp:inline>
+      </w:drawing>
     </w:r>
     <w:r>
       <w:rPr>
         <w:rtl w:val="0"/>
       </w:rPr>
+      <w:tab/>
+      <w:tab/>
+      <w:tab/>
+      <w:tab/>
     </w:r>
     <w:r>
       <mc:AlternateContent>
@@ -1409,15 +1453,15 @@
             <wp:anchor allowOverlap="1" behindDoc="0" distB="0" distT="0" distL="114300" distR="114300" hidden="0" layoutInCell="1" locked="0" relativeHeight="0" simplePos="0">
               <wp:simplePos x="0" y="0"/>
               <wp:positionH relativeFrom="column">
-                <wp:posOffset>2654300</wp:posOffset>
+                <wp:posOffset>1471613</wp:posOffset>
               </wp:positionH>
               <wp:positionV relativeFrom="paragraph">
-                <wp:posOffset>165100</wp:posOffset>
+                <wp:posOffset>-180339</wp:posOffset>
               </wp:positionV>
               <wp:extent cx="5443537" cy="1204913"/>
               <wp:effectExtent b="0" l="0" r="0" t="0"/>
               <wp:wrapNone/>
-              <wp:docPr id="1" name=""/>
+              <wp:docPr id="2" name=""/>
               <a:graphic>
                 <a:graphicData uri="http://schemas.microsoft.com/office/word/2010/wordprocessingShape">
                   <wps:wsp>
@@ -1555,24 +1599,24 @@
             <wp:anchor allowOverlap="1" behindDoc="0" distB="0" distT="0" distL="114300" distR="114300" hidden="0" layoutInCell="1" locked="0" relativeHeight="0" simplePos="0">
               <wp:simplePos x="0" y="0"/>
               <wp:positionH relativeFrom="column">
-                <wp:posOffset>2654300</wp:posOffset>
+                <wp:posOffset>1471613</wp:posOffset>
               </wp:positionH>
               <wp:positionV relativeFrom="paragraph">
-                <wp:posOffset>165100</wp:posOffset>
+                <wp:posOffset>-180339</wp:posOffset>
               </wp:positionV>
               <wp:extent cx="5443537" cy="1204913"/>
               <wp:effectExtent b="0" l="0" r="0" t="0"/>
               <wp:wrapNone/>
-              <wp:docPr id="1" name="image4.png"/>
+              <wp:docPr id="2" name="image5.png"/>
               <a:graphic>
                 <a:graphicData uri="http://schemas.openxmlformats.org/drawingml/2006/picture">
                   <pic:pic>
                     <pic:nvPicPr>
-                      <pic:cNvPr id="0" name="image4.png"/>
+                      <pic:cNvPr id="0" name="image5.png"/>
                       <pic:cNvPicPr preferRelativeResize="0"/>
                     </pic:nvPicPr>
                     <pic:blipFill>
-                      <a:blip r:embed="rId2"/>
+                      <a:blip r:embed="rId3"/>
                       <a:srcRect/>
                       <a:stretch>
                         <a:fillRect/>
@@ -1593,201 +1637,6 @@
           </w:drawing>
         </mc:Fallback>
       </mc:AlternateContent>
-    </w:r>
-  </w:p>
-  <w:p>
-    <w:pPr>
-      <w:keepNext w:val="0"/>
-      <w:keepLines w:val="0"/>
-      <w:pageBreakBefore w:val="0"/>
-      <w:widowControl w:val="1"/>
-      <w:pBdr>
-        <w:top w:space="0" w:sz="0" w:val="nil"/>
-        <w:left w:space="0" w:sz="0" w:val="nil"/>
-        <w:bottom w:space="0" w:sz="0" w:val="nil"/>
-        <w:right w:space="0" w:sz="0" w:val="nil"/>
-        <w:between w:space="0" w:sz="0" w:val="nil"/>
-      </w:pBdr>
-      <w:shd w:fill="auto" w:val="clear"/>
-      <w:tabs>
-        <w:tab w:val="center" w:leader="none" w:pos="4252"/>
-        <w:tab w:val="right" w:leader="none" w:pos="8504"/>
-        <w:tab w:val="left" w:leader="none" w:pos="3570"/>
-      </w:tabs>
-      <w:spacing w:after="0" w:before="0" w:line="240" w:lineRule="auto"/>
-      <w:ind w:left="0" w:right="0" w:firstLine="0"/>
-      <w:jc w:val="left"/>
-      <w:rPr>
-        <w:rFonts w:ascii="Calibri" w:cs="Calibri" w:eastAsia="Calibri" w:hAnsi="Calibri"/>
-        <w:b w:val="0"/>
-        <w:bCs w:val="0"/>
-        <w:i w:val="0"/>
-        <w:iCs w:val="0"/>
-        <w:smallCaps w:val="0"/>
-        <w:strike w:val="0"/>
-        <w:color w:val="000000"/>
-        <w:sz w:val="22"/>
-        <w:szCs w:val="22"/>
-        <w:u w:val="none"/>
-        <w:shd w:fill="auto" w:val="clear"/>
-        <w:vertAlign w:val="baseline"/>
-      </w:rPr>
-    </w:pPr>
-    <w:r>
-      <w:rPr>
-        <w:rtl w:val="0"/>
-      </w:rPr>
-    </w:r>
-  </w:p>
-  <w:p>
-    <w:pPr>
-      <w:keepNext w:val="0"/>
-      <w:keepLines w:val="0"/>
-      <w:pageBreakBefore w:val="0"/>
-      <w:widowControl w:val="1"/>
-      <w:pBdr>
-        <w:top w:space="0" w:sz="0" w:val="nil"/>
-        <w:left w:space="0" w:sz="0" w:val="nil"/>
-        <w:bottom w:space="0" w:sz="0" w:val="nil"/>
-        <w:right w:space="0" w:sz="0" w:val="nil"/>
-        <w:between w:space="0" w:sz="0" w:val="nil"/>
-      </w:pBdr>
-      <w:shd w:fill="auto" w:val="clear"/>
-      <w:tabs>
-        <w:tab w:val="center" w:leader="none" w:pos="4252"/>
-        <w:tab w:val="right" w:leader="none" w:pos="8504"/>
-        <w:tab w:val="left" w:leader="none" w:pos="3570"/>
-      </w:tabs>
-      <w:spacing w:after="0" w:before="0" w:line="240" w:lineRule="auto"/>
-      <w:ind w:left="0" w:right="0" w:firstLine="0"/>
-      <w:jc w:val="left"/>
-      <w:rPr>
-        <w:rFonts w:ascii="Calibri" w:cs="Calibri" w:eastAsia="Calibri" w:hAnsi="Calibri"/>
-        <w:b w:val="0"/>
-        <w:bCs w:val="0"/>
-        <w:i w:val="0"/>
-        <w:iCs w:val="0"/>
-        <w:smallCaps w:val="0"/>
-        <w:strike w:val="0"/>
-        <w:color w:val="000000"/>
-        <w:sz w:val="22"/>
-        <w:szCs w:val="22"/>
-        <w:u w:val="none"/>
-        <w:shd w:fill="auto" w:val="clear"/>
-        <w:vertAlign w:val="baseline"/>
-      </w:rPr>
-    </w:pPr>
-    <w:r>
-      <w:rPr>
-        <w:rFonts w:ascii="Calibri" w:cs="Calibri" w:eastAsia="Calibri" w:hAnsi="Calibri"/>
-        <w:b w:val="0"/>
-        <w:bCs w:val="0"/>
-        <w:i w:val="0"/>
-        <w:iCs w:val="0"/>
-        <w:smallCaps w:val="0"/>
-        <w:strike w:val="0"/>
-        <w:color w:val="000000"/>
-        <w:sz w:val="22"/>
-        <w:szCs w:val="22"/>
-        <w:u w:val="none"/>
-        <w:shd w:fill="auto" w:val="clear"/>
-        <w:vertAlign w:val="baseline"/>
-      </w:rPr>
-      <w:drawing>
-        <wp:inline distB="0" distT="0" distL="0" distR="0">
-          <wp:extent cx="1169803" cy="976110"/>
-          <wp:effectExtent b="0" l="0" r="0" t="0"/>
-          <wp:docPr id="3" name="image3.jpg"/>
-          <a:graphic>
-            <a:graphicData uri="http://schemas.openxmlformats.org/drawingml/2006/picture">
-              <pic:pic>
-                <pic:nvPicPr>
-                  <pic:cNvPr id="0" name="image3.jpg"/>
-                  <pic:cNvPicPr preferRelativeResize="0"/>
-                </pic:nvPicPr>
-                <pic:blipFill>
-                  <a:blip r:embed="rId3"/>
-                  <a:srcRect b="0" l="0" r="0" t="0"/>
-                  <a:stretch>
-                    <a:fillRect/>
-                  </a:stretch>
-                </pic:blipFill>
-                <pic:spPr>
-                  <a:xfrm>
-                    <a:off x="0" y="0"/>
-                    <a:ext cx="1169803" cy="976110"/>
-                  </a:xfrm>
-                  <a:prstGeom prst="rect"/>
-                  <a:ln/>
-                </pic:spPr>
-              </pic:pic>
-            </a:graphicData>
-          </a:graphic>
-        </wp:inline>
-      </w:drawing>
-    </w:r>
-    <w:r>
-      <w:rPr>
-        <w:rtl w:val="0"/>
-      </w:rPr>
-    </w:r>
-  </w:p>
-  <w:p>
-    <w:pPr>
-      <w:keepNext w:val="0"/>
-      <w:keepLines w:val="0"/>
-      <w:pageBreakBefore w:val="0"/>
-      <w:widowControl w:val="1"/>
-      <w:pBdr>
-        <w:top w:space="0" w:sz="0" w:val="nil"/>
-        <w:left w:space="0" w:sz="0" w:val="nil"/>
-        <w:bottom w:space="0" w:sz="0" w:val="nil"/>
-        <w:right w:space="0" w:sz="0" w:val="nil"/>
-        <w:between w:space="0" w:sz="0" w:val="nil"/>
-      </w:pBdr>
-      <w:shd w:fill="auto" w:val="clear"/>
-      <w:tabs>
-        <w:tab w:val="center" w:leader="none" w:pos="4252"/>
-        <w:tab w:val="right" w:leader="none" w:pos="8504"/>
-        <w:tab w:val="left" w:leader="none" w:pos="3570"/>
-      </w:tabs>
-      <w:spacing w:after="0" w:before="0" w:line="240" w:lineRule="auto"/>
-      <w:ind w:left="0" w:right="0" w:firstLine="0"/>
-      <w:jc w:val="left"/>
-      <w:rPr>
-        <w:rFonts w:ascii="Calibri" w:cs="Calibri" w:eastAsia="Calibri" w:hAnsi="Calibri"/>
-        <w:b w:val="0"/>
-        <w:bCs w:val="0"/>
-        <w:i w:val="0"/>
-        <w:iCs w:val="0"/>
-        <w:smallCaps w:val="0"/>
-        <w:strike w:val="0"/>
-        <w:color w:val="000000"/>
-        <w:sz w:val="22"/>
-        <w:szCs w:val="22"/>
-        <w:u w:val="none"/>
-        <w:shd w:fill="auto" w:val="clear"/>
-        <w:vertAlign w:val="baseline"/>
-      </w:rPr>
-    </w:pPr>
-    <w:r>
-      <w:rPr>
-        <w:rFonts w:ascii="Calibri" w:cs="Calibri" w:eastAsia="Calibri" w:hAnsi="Calibri"/>
-        <w:b w:val="0"/>
-        <w:bCs w:val="0"/>
-        <w:i w:val="0"/>
-        <w:iCs w:val="0"/>
-        <w:smallCaps w:val="0"/>
-        <w:strike w:val="0"/>
-        <w:color w:val="000000"/>
-        <w:sz w:val="22"/>
-        <w:szCs w:val="22"/>
-        <w:u w:val="none"/>
-        <w:shd w:fill="auto" w:val="clear"/>
-        <w:vertAlign w:val="baseline"/>
-        <w:rtl w:val="0"/>
-      </w:rPr>
-      <w:tab/>
     </w:r>
   </w:p>
 </w:hdr>

</xml_diff>